<commit_message>
edits to proposal and claude.md
</commit_message>
<xml_diff>
--- a/Team-Docs/Proposal.docx
+++ b/Team-Docs/Proposal.docx
@@ -763,13 +763,7 @@
       </w:pPr>
       <w:hyperlink w:anchor="sec_22" w:history="1">
         <w:r>
-          <w:t>4.4 Mitigation</w:t>
-        </w:r>
-        <w:r>
-          <w:t xml:space="preserve"> </w:t>
-        </w:r>
-        <w:r>
-          <w:t>Strategies</w:t>
+          <w:t>4.4 Mitigation Strategies</w:t>
         </w:r>
         <w:r>
           <w:tab/>
@@ -803,13 +797,7 @@
       </w:pPr>
       <w:hyperlink w:anchor="sec_24" w:history="1">
         <w:r>
-          <w:t>Appendix A. AI Use Disclosure (Level 3 – AI C</w:t>
-        </w:r>
-        <w:r>
-          <w:t>o</w:t>
-        </w:r>
-        <w:r>
-          <w:t>llaboration)</w:t>
+          <w:t>Appendix A. AI Use Disclosure (Level 3 – AI Collaboration)</w:t>
         </w:r>
         <w:r>
           <w:tab/>
@@ -2169,23 +2157,7 @@
                 <w:bCs/>
                 <w:color w:val="1F4E79"/>
               </w:rPr>
-              <w:t>Biw</w:t>
-            </w:r>
-            <w:r>
-              <w:rPr>
-                <w:b/>
-                <w:bCs/>
-                <w:color w:val="1F4E79"/>
-              </w:rPr>
-              <w:t xml:space="preserve">eekly w/ </w:t>
-            </w:r>
-            <w:r>
-              <w:rPr>
-                <w:b/>
-                <w:bCs/>
-                <w:color w:val="1F4E79"/>
-              </w:rPr>
-              <w:t>Blanka, Thursday afternoons or mornings (</w:t>
+              <w:t>Biweekly w/ Blanka, Thursday afternoons or mornings (</w:t>
             </w:r>
             <w:proofErr w:type="spellStart"/>
             <w:r>
@@ -2383,7 +2355,7 @@
       </w:r>
       <w:bookmarkEnd w:id="9"/>
       <w:r>
-        <w:t xml:space="preserve"> (THIS IS THE PART I NEED EYES ON VAL AND NEDA)</w:t>
+        <w:t xml:space="preserve"> </w:t>
       </w:r>
     </w:p>
     <w:tbl>
@@ -2897,13 +2869,7 @@
               <w:rPr>
                 <w:color w:val="1F4E79"/>
               </w:rPr>
-              <w:t>concept.</w:t>
-            </w:r>
-            <w:r>
-              <w:rPr>
-                <w:color w:val="1F4E79"/>
-              </w:rPr>
-              <w:t>Rework</w:t>
+              <w:t>concept.Rework</w:t>
             </w:r>
             <w:proofErr w:type="spellEnd"/>
             <w:proofErr w:type="gramEnd"/>
@@ -9619,8 +9585,6 @@
       </w:pPr>
       <w:r>
         <w:br/>
-      </w:r>
-      <w:r>
         <w:t>3.4 Challenges Encountered</w:t>
       </w:r>
       <w:bookmarkEnd w:id="15"/>

</xml_diff>